<commit_message>
Add day 3 lab and revise day 2
</commit_message>
<xml_diff>
--- a/lab2.docx
+++ b/lab2.docx
@@ -16,37 +16,73 @@
     </w:p>
     <w:p>
       <w:r>
+        <w:t>Cloud cost: ~$217.48/month</w:t>
+      </w:r>
+    </w:p>
+    <w:p>
+      <w:r>
+        <w:t>On-prem cost</w:t>
+      </w:r>
+      <w:r>
+        <w:t xml:space="preserve">: </w:t>
+      </w:r>
+      <w:r>
+        <w:t>$3,140</w:t>
+      </w:r>
+      <w:r>
+        <w:t xml:space="preserve"> for first month and $140/month</w:t>
+      </w:r>
+    </w:p>
+    <w:p>
+      <w:r>
+        <w:t xml:space="preserve">- Server hardware: ~$1,800 </w:t>
+      </w:r>
+      <w:r>
+        <w:br/>
+      </w:r>
+      <w:r>
+        <w:t xml:space="preserve">- Windows Server 2022 license: ~$1,000 </w:t>
+      </w:r>
+      <w:r>
+        <w:br/>
+      </w:r>
+      <w:r>
+        <w:t xml:space="preserve">- Setup/installation labor (one-time): ~$200 </w:t>
+      </w:r>
+      <w:r>
+        <w:br/>
+        <w:t xml:space="preserve">- </w:t>
+      </w:r>
+      <w:r>
+        <w:t>Maintenance / IT support (per month): ~$1</w:t>
+      </w:r>
+      <w:r>
+        <w:t>4</w:t>
+      </w:r>
+      <w:r>
+        <w:t>0</w:t>
+      </w:r>
+    </w:p>
+    <w:p>
+      <w:r>
+        <w:rPr>
+          <w:noProof/>
+        </w:rPr>
         <w:drawing>
-          <wp:inline distT="0" distB="0" distL="0" distR="0" wp14:anchorId="65BB452F" wp14:editId="7A10F56A">
-            <wp:extent cx="5943600" cy="5424170"/>
-            <wp:effectExtent l="0" t="0" r="0" b="5080"/>
-            <wp:docPr id="1648104163" name="Picture 1"/>
-            <wp:cNvGraphicFramePr>
-              <a:graphicFrameLocks xmlns:a="http://schemas.openxmlformats.org/drawingml/2006/main" noChangeAspect="1"/>
-            </wp:cNvGraphicFramePr>
+          <wp:inline distT="0" distB="0" distL="0" distR="0" wp14:anchorId="703D8BBB" wp14:editId="77035C06">
+            <wp:extent cx="5943600" cy="2863215"/>
+            <wp:effectExtent l="0" t="0" r="0" b="13335"/>
+            <wp:docPr id="1962658282" name="Chart 1">
+              <a:extLst xmlns:a="http://schemas.openxmlformats.org/drawingml/2006/main">
+                <a:ext uri="{FF2B5EF4-FFF2-40B4-BE49-F238E27FC236}">
+                  <a16:creationId xmlns:a16="http://schemas.microsoft.com/office/drawing/2014/main" id="{00000000-0008-0000-0100-000002000000}"/>
+                </a:ext>
+              </a:extLst>
+            </wp:docPr>
+            <wp:cNvGraphicFramePr/>
             <a:graphic xmlns:a="http://schemas.openxmlformats.org/drawingml/2006/main">
-              <a:graphicData uri="http://schemas.openxmlformats.org/drawingml/2006/picture">
-                <pic:pic xmlns:pic="http://schemas.openxmlformats.org/drawingml/2006/picture">
-                  <pic:nvPicPr>
-                    <pic:cNvPr id="1648104163" name=""/>
-                    <pic:cNvPicPr/>
-                  </pic:nvPicPr>
-                  <pic:blipFill>
-                    <a:blip r:embed="rId5"/>
-                    <a:stretch>
-                      <a:fillRect/>
-                    </a:stretch>
-                  </pic:blipFill>
-                  <pic:spPr>
-                    <a:xfrm>
-                      <a:off x="0" y="0"/>
-                      <a:ext cx="5943600" cy="5424170"/>
-                    </a:xfrm>
-                    <a:prstGeom prst="rect">
-                      <a:avLst/>
-                    </a:prstGeom>
-                  </pic:spPr>
-                </pic:pic>
+              <a:graphicData uri="http://schemas.openxmlformats.org/drawingml/2006/chart">
+                <c:chart xmlns:c="http://schemas.openxmlformats.org/drawingml/2006/chart" xmlns:r="http://schemas.openxmlformats.org/officeDocument/2006/relationships" r:id="rId5"/>
               </a:graphicData>
             </a:graphic>
           </wp:inline>
@@ -55,34 +91,14 @@
     </w:p>
     <w:p>
       <w:r>
-        <w:t>Assumptions for on-prem option (small project)</w:t>
-      </w:r>
-      <w:r>
-        <w:br/>
-        <w:t>Server-hardware: $600</w:t>
-      </w:r>
-      <w:r>
-        <w:br/>
-        <w:t>OS: $0 (using Ubuntu)</w:t>
-      </w:r>
-      <w:r>
-        <w:br/>
-        <w:t>Installation: $100 (one-time)</w:t>
-      </w:r>
-      <w:r>
-        <w:br/>
-        <w:t>Maintenance: $45 (per month)</w:t>
+        <w:t>After 36 months, the total cost of Cloud and On-Prem is nearly identical. The break-even point will start from month 37 onward.</w:t>
       </w:r>
     </w:p>
     <w:p>
       <w:r>
-        <w:t>C</w:t>
-      </w:r>
-      <w:r>
-        <w:t>loud suits short-term or uncertain workloads since there's no upfront investment to lose. On-prem pays off once a workload runs long-term, since the lower recurring cost recovers the initial hardware cost over time.</w:t>
+        <w:br w:type="page"/>
       </w:r>
     </w:p>
-    <w:p/>
     <w:p>
       <w:pPr>
         <w:pStyle w:val="ListParagraph"/>
@@ -98,11 +114,14 @@
     </w:p>
     <w:p>
       <w:r>
+        <w:rPr>
+          <w:noProof/>
+        </w:rPr>
         <w:drawing>
-          <wp:inline distT="0" distB="0" distL="0" distR="0" wp14:anchorId="7CE3463B" wp14:editId="168319B3">
+          <wp:inline distT="0" distB="0" distL="0" distR="0" wp14:anchorId="75270C39" wp14:editId="7CFC682E">
             <wp:extent cx="5943600" cy="3342005"/>
             <wp:effectExtent l="0" t="0" r="0" b="0"/>
-            <wp:docPr id="1990108295" name="Picture 1"/>
+            <wp:docPr id="671421202" name="Picture 1"/>
             <wp:cNvGraphicFramePr>
               <a:graphicFrameLocks xmlns:a="http://schemas.openxmlformats.org/drawingml/2006/main" noChangeAspect="1"/>
             </wp:cNvGraphicFramePr>
@@ -110,7 +129,7 @@
               <a:graphicData uri="http://schemas.openxmlformats.org/drawingml/2006/picture">
                 <pic:pic xmlns:pic="http://schemas.openxmlformats.org/drawingml/2006/picture">
                   <pic:nvPicPr>
-                    <pic:cNvPr id="1990108295" name=""/>
+                    <pic:cNvPr id="671421202" name=""/>
                     <pic:cNvPicPr/>
                   </pic:nvPicPr>
                   <pic:blipFill>
@@ -136,6 +155,53 @@
       </w:r>
     </w:p>
     <w:p>
+      <w:r>
+        <w:rPr>
+          <w:noProof/>
+        </w:rPr>
+        <w:drawing>
+          <wp:inline distT="0" distB="0" distL="0" distR="0" wp14:anchorId="4742666A" wp14:editId="6870A999">
+            <wp:extent cx="5943600" cy="3713480"/>
+            <wp:effectExtent l="0" t="0" r="0" b="1270"/>
+            <wp:docPr id="2112027762" name="Picture 1"/>
+            <wp:cNvGraphicFramePr>
+              <a:graphicFrameLocks xmlns:a="http://schemas.openxmlformats.org/drawingml/2006/main" noChangeAspect="1"/>
+            </wp:cNvGraphicFramePr>
+            <a:graphic xmlns:a="http://schemas.openxmlformats.org/drawingml/2006/main">
+              <a:graphicData uri="http://schemas.openxmlformats.org/drawingml/2006/picture">
+                <pic:pic xmlns:pic="http://schemas.openxmlformats.org/drawingml/2006/picture">
+                  <pic:nvPicPr>
+                    <pic:cNvPr id="2112027762" name=""/>
+                    <pic:cNvPicPr/>
+                  </pic:nvPicPr>
+                  <pic:blipFill>
+                    <a:blip r:embed="rId7"/>
+                    <a:stretch>
+                      <a:fillRect/>
+                    </a:stretch>
+                  </pic:blipFill>
+                  <pic:spPr>
+                    <a:xfrm>
+                      <a:off x="0" y="0"/>
+                      <a:ext cx="5943600" cy="3713480"/>
+                    </a:xfrm>
+                    <a:prstGeom prst="rect">
+                      <a:avLst/>
+                    </a:prstGeom>
+                  </pic:spPr>
+                </pic:pic>
+              </a:graphicData>
+            </a:graphic>
+          </wp:inline>
+        </w:drawing>
+      </w:r>
+    </w:p>
+    <w:p>
+      <w:r>
+        <w:br w:type="page"/>
+      </w:r>
+    </w:p>
+    <w:p>
       <w:pPr>
         <w:pStyle w:val="ListParagraph"/>
         <w:numPr>
@@ -144,11 +210,18 @@
         </w:numPr>
       </w:pPr>
       <w:r>
-        <w:t>System monitoring. Using loop to make it work automatically without refeshing</w:t>
+        <w:lastRenderedPageBreak/>
+        <w:t xml:space="preserve">System monitoring. Using loop to make it work automatically without </w:t>
+      </w:r>
+      <w:r>
+        <w:t>refreshing</w:t>
       </w:r>
     </w:p>
     <w:p>
       <w:r>
+        <w:rPr>
+          <w:noProof/>
+        </w:rPr>
         <w:drawing>
           <wp:inline distT="0" distB="0" distL="0" distR="0" wp14:anchorId="48F9BD0C" wp14:editId="307947BD">
             <wp:extent cx="5943600" cy="2416175"/>
@@ -165,7 +238,7 @@
                     <pic:cNvPicPr/>
                   </pic:nvPicPr>
                   <pic:blipFill>
-                    <a:blip r:embed="rId7"/>
+                    <a:blip r:embed="rId8"/>
                     <a:stretch>
                       <a:fillRect/>
                     </a:stretch>
@@ -174,6 +247,45 @@
                     <a:xfrm>
                       <a:off x="0" y="0"/>
                       <a:ext cx="5943600" cy="2416175"/>
+                    </a:xfrm>
+                    <a:prstGeom prst="rect">
+                      <a:avLst/>
+                    </a:prstGeom>
+                  </pic:spPr>
+                </pic:pic>
+              </a:graphicData>
+            </a:graphic>
+          </wp:inline>
+        </w:drawing>
+      </w:r>
+    </w:p>
+    <w:p>
+      <w:r>
+        <w:drawing>
+          <wp:inline distT="0" distB="0" distL="0" distR="0" wp14:anchorId="30A696F5" wp14:editId="71277C13">
+            <wp:extent cx="5943600" cy="3463925"/>
+            <wp:effectExtent l="0" t="0" r="0" b="3175"/>
+            <wp:docPr id="1025396067" name="Picture 1"/>
+            <wp:cNvGraphicFramePr>
+              <a:graphicFrameLocks xmlns:a="http://schemas.openxmlformats.org/drawingml/2006/main" noChangeAspect="1"/>
+            </wp:cNvGraphicFramePr>
+            <a:graphic xmlns:a="http://schemas.openxmlformats.org/drawingml/2006/main">
+              <a:graphicData uri="http://schemas.openxmlformats.org/drawingml/2006/picture">
+                <pic:pic xmlns:pic="http://schemas.openxmlformats.org/drawingml/2006/picture">
+                  <pic:nvPicPr>
+                    <pic:cNvPr id="1025396067" name=""/>
+                    <pic:cNvPicPr/>
+                  </pic:nvPicPr>
+                  <pic:blipFill>
+                    <a:blip r:embed="rId9"/>
+                    <a:stretch>
+                      <a:fillRect/>
+                    </a:stretch>
+                  </pic:blipFill>
+                  <pic:spPr>
+                    <a:xfrm>
+                      <a:off x="0" y="0"/>
+                      <a:ext cx="5943600" cy="3463925"/>
                     </a:xfrm>
                     <a:prstGeom prst="rect">
                       <a:avLst/>
@@ -1213,6 +1325,887 @@
 </w:styles>
 </file>
 
+<file path=word/charts/chart1.xml><?xml version="1.0" encoding="utf-8"?>
+<c:chartSpace xmlns:c="http://schemas.openxmlformats.org/drawingml/2006/chart" xmlns:a="http://schemas.openxmlformats.org/drawingml/2006/main" xmlns:r="http://schemas.openxmlformats.org/officeDocument/2006/relationships" xmlns:c16r2="http://schemas.microsoft.com/office/drawing/2015/06/chart">
+  <c:date1904 val="0"/>
+  <c:lang val="en-US"/>
+  <c:roundedCorners val="0"/>
+  <mc:AlternateContent xmlns:mc="http://schemas.openxmlformats.org/markup-compatibility/2006">
+    <mc:Choice xmlns:c14="http://schemas.microsoft.com/office/drawing/2007/8/2/chart" Requires="c14">
+      <c14:style val="102"/>
+    </mc:Choice>
+    <mc:Fallback>
+      <c:style val="2"/>
+    </mc:Fallback>
+  </mc:AlternateContent>
+  <c:chart>
+    <c:title>
+      <c:tx>
+        <c:rich>
+          <a:bodyPr rot="0"/>
+          <a:lstStyle/>
+          <a:p>
+            <a:pPr>
+              <a:defRPr sz="1800" b="1" strike="noStrike" spc="-1">
+                <a:solidFill>
+                  <a:srgbClr val="000000"/>
+                </a:solidFill>
+                <a:latin typeface="Calibri"/>
+              </a:defRPr>
+            </a:pPr>
+            <a:r>
+              <a:rPr lang="en-US" sz="1800" b="1" strike="noStrike" spc="-1">
+                <a:solidFill>
+                  <a:srgbClr val="000000"/>
+                </a:solidFill>
+                <a:latin typeface="Calibri"/>
+              </a:rPr>
+              <a:t>Cumulative Cost: On-Prem vs Cloud</a:t>
+            </a:r>
+          </a:p>
+        </c:rich>
+      </c:tx>
+      <c:overlay val="0"/>
+      <c:spPr>
+        <a:noFill/>
+        <a:ln w="0">
+          <a:noFill/>
+        </a:ln>
+      </c:spPr>
+    </c:title>
+    <c:autoTitleDeleted val="0"/>
+    <c:plotArea>
+      <c:layout/>
+      <c:lineChart>
+        <c:grouping val="standard"/>
+        <c:varyColors val="0"/>
+        <c:ser>
+          <c:idx val="0"/>
+          <c:order val="0"/>
+          <c:tx>
+            <c:strRef>
+              <c:f>'TCO Comparison'!$E$5</c:f>
+              <c:strCache>
+                <c:ptCount val="1"/>
+                <c:pt idx="0">
+                  <c:v>On-Prem Cumulative</c:v>
+                </c:pt>
+              </c:strCache>
+            </c:strRef>
+          </c:tx>
+          <c:spPr>
+            <a:ln w="28440">
+              <a:solidFill>
+                <a:srgbClr val="4A7EBB"/>
+              </a:solidFill>
+              <a:round/>
+            </a:ln>
+          </c:spPr>
+          <c:marker>
+            <c:symbol val="none"/>
+          </c:marker>
+          <c:dLbls>
+            <c:spPr>
+              <a:noFill/>
+              <a:ln>
+                <a:noFill/>
+              </a:ln>
+              <a:effectLst/>
+            </c:spPr>
+            <c:txPr>
+              <a:bodyPr wrap="none"/>
+              <a:lstStyle/>
+              <a:p>
+                <a:pPr>
+                  <a:defRPr sz="1000" b="0" strike="noStrike" spc="-1">
+                    <a:latin typeface="Arial"/>
+                  </a:defRPr>
+                </a:pPr>
+                <a:endParaRPr lang="en-US"/>
+              </a:p>
+            </c:txPr>
+            <c:showLegendKey val="0"/>
+            <c:showVal val="0"/>
+            <c:showCatName val="0"/>
+            <c:showSerName val="0"/>
+            <c:showPercent val="0"/>
+            <c:showBubbleSize val="1"/>
+            <c:separator> </c:separator>
+            <c:showLeaderLines val="0"/>
+            <c:extLst>
+              <c:ext xmlns:c15="http://schemas.microsoft.com/office/drawing/2012/chart" uri="{CE6537A1-D6FC-4f65-9D91-7224C49458BB}">
+                <c15:showLeaderLines val="1"/>
+              </c:ext>
+            </c:extLst>
+          </c:dLbls>
+          <c:cat>
+            <c:strRef>
+              <c:f>'TCO Comparison'!$C$6:$C$41</c:f>
+              <c:strCache>
+                <c:ptCount val="36"/>
+                <c:pt idx="0">
+                  <c:v>Month 1</c:v>
+                </c:pt>
+                <c:pt idx="1">
+                  <c:v>Month 2</c:v>
+                </c:pt>
+                <c:pt idx="2">
+                  <c:v>Month 3</c:v>
+                </c:pt>
+                <c:pt idx="3">
+                  <c:v>Month 4</c:v>
+                </c:pt>
+                <c:pt idx="4">
+                  <c:v>Month 5</c:v>
+                </c:pt>
+                <c:pt idx="5">
+                  <c:v>Month 6</c:v>
+                </c:pt>
+                <c:pt idx="6">
+                  <c:v>Month 7</c:v>
+                </c:pt>
+                <c:pt idx="7">
+                  <c:v>Month 8</c:v>
+                </c:pt>
+                <c:pt idx="8">
+                  <c:v>Month 9</c:v>
+                </c:pt>
+                <c:pt idx="9">
+                  <c:v>Month 10</c:v>
+                </c:pt>
+                <c:pt idx="10">
+                  <c:v>Month 11</c:v>
+                </c:pt>
+                <c:pt idx="11">
+                  <c:v>Month 12</c:v>
+                </c:pt>
+                <c:pt idx="12">
+                  <c:v>Month 13</c:v>
+                </c:pt>
+                <c:pt idx="13">
+                  <c:v>Month 14</c:v>
+                </c:pt>
+                <c:pt idx="14">
+                  <c:v>Month 15</c:v>
+                </c:pt>
+                <c:pt idx="15">
+                  <c:v>Month 16</c:v>
+                </c:pt>
+                <c:pt idx="16">
+                  <c:v>Month 17</c:v>
+                </c:pt>
+                <c:pt idx="17">
+                  <c:v>Month 18</c:v>
+                </c:pt>
+                <c:pt idx="18">
+                  <c:v>Month 19</c:v>
+                </c:pt>
+                <c:pt idx="19">
+                  <c:v>Month 20</c:v>
+                </c:pt>
+                <c:pt idx="20">
+                  <c:v>Month 21</c:v>
+                </c:pt>
+                <c:pt idx="21">
+                  <c:v>Month 22</c:v>
+                </c:pt>
+                <c:pt idx="22">
+                  <c:v>Month 23</c:v>
+                </c:pt>
+                <c:pt idx="23">
+                  <c:v>Month 24</c:v>
+                </c:pt>
+                <c:pt idx="24">
+                  <c:v>Month 25</c:v>
+                </c:pt>
+                <c:pt idx="25">
+                  <c:v>Month 26</c:v>
+                </c:pt>
+                <c:pt idx="26">
+                  <c:v>Month 27</c:v>
+                </c:pt>
+                <c:pt idx="27">
+                  <c:v>Month 28</c:v>
+                </c:pt>
+                <c:pt idx="28">
+                  <c:v>Month 29</c:v>
+                </c:pt>
+                <c:pt idx="29">
+                  <c:v>Month 30</c:v>
+                </c:pt>
+                <c:pt idx="30">
+                  <c:v>Month 31</c:v>
+                </c:pt>
+                <c:pt idx="31">
+                  <c:v>Month 32</c:v>
+                </c:pt>
+                <c:pt idx="32">
+                  <c:v>Month 33</c:v>
+                </c:pt>
+                <c:pt idx="33">
+                  <c:v>Month 34</c:v>
+                </c:pt>
+                <c:pt idx="34">
+                  <c:v>Month 35</c:v>
+                </c:pt>
+                <c:pt idx="35">
+                  <c:v>Month 36</c:v>
+                </c:pt>
+              </c:strCache>
+            </c:strRef>
+          </c:cat>
+          <c:val>
+            <c:numRef>
+              <c:f>'TCO Comparison'!$E$6:$E$41</c:f>
+              <c:numCache>
+                <c:formatCode>\$#,##0</c:formatCode>
+                <c:ptCount val="36"/>
+                <c:pt idx="0">
+                  <c:v>3140</c:v>
+                </c:pt>
+                <c:pt idx="1">
+                  <c:v>3280</c:v>
+                </c:pt>
+                <c:pt idx="2">
+                  <c:v>3420</c:v>
+                </c:pt>
+                <c:pt idx="3">
+                  <c:v>3560</c:v>
+                </c:pt>
+                <c:pt idx="4">
+                  <c:v>3700</c:v>
+                </c:pt>
+                <c:pt idx="5">
+                  <c:v>3840</c:v>
+                </c:pt>
+                <c:pt idx="6">
+                  <c:v>3980</c:v>
+                </c:pt>
+                <c:pt idx="7">
+                  <c:v>4120</c:v>
+                </c:pt>
+                <c:pt idx="8">
+                  <c:v>4260</c:v>
+                </c:pt>
+                <c:pt idx="9">
+                  <c:v>4400</c:v>
+                </c:pt>
+                <c:pt idx="10">
+                  <c:v>4540</c:v>
+                </c:pt>
+                <c:pt idx="11">
+                  <c:v>4680</c:v>
+                </c:pt>
+                <c:pt idx="12">
+                  <c:v>4820</c:v>
+                </c:pt>
+                <c:pt idx="13">
+                  <c:v>4960</c:v>
+                </c:pt>
+                <c:pt idx="14">
+                  <c:v>5100</c:v>
+                </c:pt>
+                <c:pt idx="15">
+                  <c:v>5240</c:v>
+                </c:pt>
+                <c:pt idx="16">
+                  <c:v>5380</c:v>
+                </c:pt>
+                <c:pt idx="17">
+                  <c:v>5520</c:v>
+                </c:pt>
+                <c:pt idx="18">
+                  <c:v>5660</c:v>
+                </c:pt>
+                <c:pt idx="19">
+                  <c:v>5800</c:v>
+                </c:pt>
+                <c:pt idx="20">
+                  <c:v>5940</c:v>
+                </c:pt>
+                <c:pt idx="21">
+                  <c:v>6080</c:v>
+                </c:pt>
+                <c:pt idx="22">
+                  <c:v>6220</c:v>
+                </c:pt>
+                <c:pt idx="23">
+                  <c:v>6360</c:v>
+                </c:pt>
+                <c:pt idx="24">
+                  <c:v>6500</c:v>
+                </c:pt>
+                <c:pt idx="25">
+                  <c:v>6640</c:v>
+                </c:pt>
+                <c:pt idx="26">
+                  <c:v>6780</c:v>
+                </c:pt>
+                <c:pt idx="27">
+                  <c:v>6920</c:v>
+                </c:pt>
+                <c:pt idx="28">
+                  <c:v>7060</c:v>
+                </c:pt>
+                <c:pt idx="29">
+                  <c:v>7200</c:v>
+                </c:pt>
+                <c:pt idx="30">
+                  <c:v>7340</c:v>
+                </c:pt>
+                <c:pt idx="31">
+                  <c:v>7480</c:v>
+                </c:pt>
+                <c:pt idx="32">
+                  <c:v>7620</c:v>
+                </c:pt>
+                <c:pt idx="33">
+                  <c:v>7760</c:v>
+                </c:pt>
+                <c:pt idx="34">
+                  <c:v>7900</c:v>
+                </c:pt>
+                <c:pt idx="35">
+                  <c:v>8040</c:v>
+                </c:pt>
+              </c:numCache>
+            </c:numRef>
+          </c:val>
+          <c:smooth val="1"/>
+          <c:extLst>
+            <c:ext xmlns:c16="http://schemas.microsoft.com/office/drawing/2014/chart" uri="{C3380CC4-5D6E-409C-BE32-E72D297353CC}">
+              <c16:uniqueId val="{00000000-12AE-499A-8514-34C6042D8C40}"/>
+            </c:ext>
+          </c:extLst>
+        </c:ser>
+        <c:ser>
+          <c:idx val="1"/>
+          <c:order val="1"/>
+          <c:tx>
+            <c:strRef>
+              <c:f>'TCO Comparison'!$G$5</c:f>
+              <c:strCache>
+                <c:ptCount val="1"/>
+                <c:pt idx="0">
+                  <c:v>Cloud Cumulative</c:v>
+                </c:pt>
+              </c:strCache>
+            </c:strRef>
+          </c:tx>
+          <c:spPr>
+            <a:ln w="28440">
+              <a:solidFill>
+                <a:srgbClr val="BE4B48"/>
+              </a:solidFill>
+              <a:round/>
+            </a:ln>
+          </c:spPr>
+          <c:marker>
+            <c:symbol val="none"/>
+          </c:marker>
+          <c:dLbls>
+            <c:spPr>
+              <a:noFill/>
+              <a:ln>
+                <a:noFill/>
+              </a:ln>
+              <a:effectLst/>
+            </c:spPr>
+            <c:txPr>
+              <a:bodyPr wrap="none"/>
+              <a:lstStyle/>
+              <a:p>
+                <a:pPr>
+                  <a:defRPr sz="1000" b="0" strike="noStrike" spc="-1">
+                    <a:latin typeface="Arial"/>
+                  </a:defRPr>
+                </a:pPr>
+                <a:endParaRPr lang="en-US"/>
+              </a:p>
+            </c:txPr>
+            <c:showLegendKey val="0"/>
+            <c:showVal val="0"/>
+            <c:showCatName val="0"/>
+            <c:showSerName val="0"/>
+            <c:showPercent val="0"/>
+            <c:showBubbleSize val="1"/>
+            <c:separator> </c:separator>
+            <c:showLeaderLines val="0"/>
+            <c:extLst>
+              <c:ext xmlns:c15="http://schemas.microsoft.com/office/drawing/2012/chart" uri="{CE6537A1-D6FC-4f65-9D91-7224C49458BB}">
+                <c15:showLeaderLines val="1"/>
+              </c:ext>
+            </c:extLst>
+          </c:dLbls>
+          <c:cat>
+            <c:strRef>
+              <c:f>'TCO Comparison'!$C$6:$C$41</c:f>
+              <c:strCache>
+                <c:ptCount val="36"/>
+                <c:pt idx="0">
+                  <c:v>Month 1</c:v>
+                </c:pt>
+                <c:pt idx="1">
+                  <c:v>Month 2</c:v>
+                </c:pt>
+                <c:pt idx="2">
+                  <c:v>Month 3</c:v>
+                </c:pt>
+                <c:pt idx="3">
+                  <c:v>Month 4</c:v>
+                </c:pt>
+                <c:pt idx="4">
+                  <c:v>Month 5</c:v>
+                </c:pt>
+                <c:pt idx="5">
+                  <c:v>Month 6</c:v>
+                </c:pt>
+                <c:pt idx="6">
+                  <c:v>Month 7</c:v>
+                </c:pt>
+                <c:pt idx="7">
+                  <c:v>Month 8</c:v>
+                </c:pt>
+                <c:pt idx="8">
+                  <c:v>Month 9</c:v>
+                </c:pt>
+                <c:pt idx="9">
+                  <c:v>Month 10</c:v>
+                </c:pt>
+                <c:pt idx="10">
+                  <c:v>Month 11</c:v>
+                </c:pt>
+                <c:pt idx="11">
+                  <c:v>Month 12</c:v>
+                </c:pt>
+                <c:pt idx="12">
+                  <c:v>Month 13</c:v>
+                </c:pt>
+                <c:pt idx="13">
+                  <c:v>Month 14</c:v>
+                </c:pt>
+                <c:pt idx="14">
+                  <c:v>Month 15</c:v>
+                </c:pt>
+                <c:pt idx="15">
+                  <c:v>Month 16</c:v>
+                </c:pt>
+                <c:pt idx="16">
+                  <c:v>Month 17</c:v>
+                </c:pt>
+                <c:pt idx="17">
+                  <c:v>Month 18</c:v>
+                </c:pt>
+                <c:pt idx="18">
+                  <c:v>Month 19</c:v>
+                </c:pt>
+                <c:pt idx="19">
+                  <c:v>Month 20</c:v>
+                </c:pt>
+                <c:pt idx="20">
+                  <c:v>Month 21</c:v>
+                </c:pt>
+                <c:pt idx="21">
+                  <c:v>Month 22</c:v>
+                </c:pt>
+                <c:pt idx="22">
+                  <c:v>Month 23</c:v>
+                </c:pt>
+                <c:pt idx="23">
+                  <c:v>Month 24</c:v>
+                </c:pt>
+                <c:pt idx="24">
+                  <c:v>Month 25</c:v>
+                </c:pt>
+                <c:pt idx="25">
+                  <c:v>Month 26</c:v>
+                </c:pt>
+                <c:pt idx="26">
+                  <c:v>Month 27</c:v>
+                </c:pt>
+                <c:pt idx="27">
+                  <c:v>Month 28</c:v>
+                </c:pt>
+                <c:pt idx="28">
+                  <c:v>Month 29</c:v>
+                </c:pt>
+                <c:pt idx="29">
+                  <c:v>Month 30</c:v>
+                </c:pt>
+                <c:pt idx="30">
+                  <c:v>Month 31</c:v>
+                </c:pt>
+                <c:pt idx="31">
+                  <c:v>Month 32</c:v>
+                </c:pt>
+                <c:pt idx="32">
+                  <c:v>Month 33</c:v>
+                </c:pt>
+                <c:pt idx="33">
+                  <c:v>Month 34</c:v>
+                </c:pt>
+                <c:pt idx="34">
+                  <c:v>Month 35</c:v>
+                </c:pt>
+                <c:pt idx="35">
+                  <c:v>Month 36</c:v>
+                </c:pt>
+              </c:strCache>
+            </c:strRef>
+          </c:cat>
+          <c:val>
+            <c:numRef>
+              <c:f>'TCO Comparison'!$G$6:$G$41</c:f>
+              <c:numCache>
+                <c:formatCode>\$#,##0</c:formatCode>
+                <c:ptCount val="36"/>
+                <c:pt idx="0">
+                  <c:v>417.48</c:v>
+                </c:pt>
+                <c:pt idx="1">
+                  <c:v>634.96</c:v>
+                </c:pt>
+                <c:pt idx="2">
+                  <c:v>852.44</c:v>
+                </c:pt>
+                <c:pt idx="3">
+                  <c:v>1069.92</c:v>
+                </c:pt>
+                <c:pt idx="4">
+                  <c:v>1287.4000000000001</c:v>
+                </c:pt>
+                <c:pt idx="5">
+                  <c:v>1504.88</c:v>
+                </c:pt>
+                <c:pt idx="6">
+                  <c:v>1722.3600000000001</c:v>
+                </c:pt>
+                <c:pt idx="7">
+                  <c:v>1939.8400000000001</c:v>
+                </c:pt>
+                <c:pt idx="8">
+                  <c:v>2157.3200000000002</c:v>
+                </c:pt>
+                <c:pt idx="9">
+                  <c:v>2374.8000000000002</c:v>
+                </c:pt>
+                <c:pt idx="10">
+                  <c:v>2592.2800000000002</c:v>
+                </c:pt>
+                <c:pt idx="11">
+                  <c:v>2809.76</c:v>
+                </c:pt>
+                <c:pt idx="12">
+                  <c:v>3027.2400000000002</c:v>
+                </c:pt>
+                <c:pt idx="13">
+                  <c:v>3244.7200000000003</c:v>
+                </c:pt>
+                <c:pt idx="14">
+                  <c:v>3462.2000000000003</c:v>
+                </c:pt>
+                <c:pt idx="15">
+                  <c:v>3679.6800000000003</c:v>
+                </c:pt>
+                <c:pt idx="16">
+                  <c:v>3897.1600000000003</c:v>
+                </c:pt>
+                <c:pt idx="17">
+                  <c:v>4114.6400000000003</c:v>
+                </c:pt>
+                <c:pt idx="18">
+                  <c:v>4332.12</c:v>
+                </c:pt>
+                <c:pt idx="19">
+                  <c:v>4549.5999999999995</c:v>
+                </c:pt>
+                <c:pt idx="20">
+                  <c:v>4767.079999999999</c:v>
+                </c:pt>
+                <c:pt idx="21">
+                  <c:v>4984.5599999999986</c:v>
+                </c:pt>
+                <c:pt idx="22">
+                  <c:v>5202.0399999999981</c:v>
+                </c:pt>
+                <c:pt idx="23">
+                  <c:v>5419.5199999999977</c:v>
+                </c:pt>
+                <c:pt idx="24">
+                  <c:v>5636.9999999999973</c:v>
+                </c:pt>
+                <c:pt idx="25">
+                  <c:v>5854.4799999999968</c:v>
+                </c:pt>
+                <c:pt idx="26">
+                  <c:v>6071.9599999999964</c:v>
+                </c:pt>
+                <c:pt idx="27">
+                  <c:v>6289.439999999996</c:v>
+                </c:pt>
+                <c:pt idx="28">
+                  <c:v>6506.9199999999955</c:v>
+                </c:pt>
+                <c:pt idx="29">
+                  <c:v>6724.3999999999951</c:v>
+                </c:pt>
+                <c:pt idx="30">
+                  <c:v>6941.8799999999947</c:v>
+                </c:pt>
+                <c:pt idx="31">
+                  <c:v>7159.3599999999942</c:v>
+                </c:pt>
+                <c:pt idx="32">
+                  <c:v>7376.8399999999938</c:v>
+                </c:pt>
+                <c:pt idx="33">
+                  <c:v>7594.3199999999933</c:v>
+                </c:pt>
+                <c:pt idx="34">
+                  <c:v>7811.7999999999929</c:v>
+                </c:pt>
+                <c:pt idx="35">
+                  <c:v>8029.2799999999925</c:v>
+                </c:pt>
+              </c:numCache>
+            </c:numRef>
+          </c:val>
+          <c:smooth val="1"/>
+          <c:extLst>
+            <c:ext xmlns:c16="http://schemas.microsoft.com/office/drawing/2014/chart" uri="{C3380CC4-5D6E-409C-BE32-E72D297353CC}">
+              <c16:uniqueId val="{00000001-12AE-499A-8514-34C6042D8C40}"/>
+            </c:ext>
+          </c:extLst>
+        </c:ser>
+        <c:dLbls>
+          <c:showLegendKey val="0"/>
+          <c:showVal val="0"/>
+          <c:showCatName val="0"/>
+          <c:showSerName val="0"/>
+          <c:showPercent val="0"/>
+          <c:showBubbleSize val="0"/>
+        </c:dLbls>
+        <c:hiLowLines>
+          <c:spPr>
+            <a:ln w="0">
+              <a:noFill/>
+            </a:ln>
+          </c:spPr>
+        </c:hiLowLines>
+        <c:smooth val="0"/>
+        <c:axId val="20483999"/>
+        <c:axId val="94869276"/>
+      </c:lineChart>
+      <c:catAx>
+        <c:axId val="20483999"/>
+        <c:scaling>
+          <c:orientation val="minMax"/>
+        </c:scaling>
+        <c:delete val="0"/>
+        <c:axPos val="b"/>
+        <c:title>
+          <c:tx>
+            <c:rich>
+              <a:bodyPr rot="0"/>
+              <a:lstStyle/>
+              <a:p>
+                <a:pPr>
+                  <a:defRPr sz="1000" b="1" strike="noStrike" spc="-1">
+                    <a:solidFill>
+                      <a:srgbClr val="000000"/>
+                    </a:solidFill>
+                    <a:latin typeface="Calibri"/>
+                  </a:defRPr>
+                </a:pPr>
+                <a:r>
+                  <a:rPr lang="en-US" sz="1000" b="1" strike="noStrike" spc="-1">
+                    <a:solidFill>
+                      <a:srgbClr val="000000"/>
+                    </a:solidFill>
+                    <a:latin typeface="Calibri"/>
+                  </a:rPr>
+                  <a:t>Month</a:t>
+                </a:r>
+              </a:p>
+            </c:rich>
+          </c:tx>
+          <c:overlay val="0"/>
+          <c:spPr>
+            <a:noFill/>
+            <a:ln w="0">
+              <a:noFill/>
+            </a:ln>
+          </c:spPr>
+        </c:title>
+        <c:numFmt formatCode="General" sourceLinked="1"/>
+        <c:majorTickMark val="none"/>
+        <c:minorTickMark val="none"/>
+        <c:tickLblPos val="nextTo"/>
+        <c:spPr>
+          <a:ln w="9360">
+            <a:solidFill>
+              <a:srgbClr val="878787"/>
+            </a:solidFill>
+            <a:round/>
+          </a:ln>
+        </c:spPr>
+        <c:txPr>
+          <a:bodyPr/>
+          <a:lstStyle/>
+          <a:p>
+            <a:pPr>
+              <a:defRPr sz="1000" b="0" strike="noStrike" spc="-1">
+                <a:solidFill>
+                  <a:srgbClr val="000000"/>
+                </a:solidFill>
+                <a:latin typeface="Calibri"/>
+              </a:defRPr>
+            </a:pPr>
+            <a:endParaRPr lang="en-US"/>
+          </a:p>
+        </c:txPr>
+        <c:crossAx val="94869276"/>
+        <c:crosses val="autoZero"/>
+        <c:auto val="1"/>
+        <c:lblAlgn val="ctr"/>
+        <c:lblOffset val="100"/>
+        <c:noMultiLvlLbl val="0"/>
+      </c:catAx>
+      <c:valAx>
+        <c:axId val="94869276"/>
+        <c:scaling>
+          <c:orientation val="minMax"/>
+        </c:scaling>
+        <c:delete val="0"/>
+        <c:axPos val="l"/>
+        <c:majorGridlines>
+          <c:spPr>
+            <a:ln w="9360">
+              <a:solidFill>
+                <a:srgbClr val="878787"/>
+              </a:solidFill>
+              <a:round/>
+            </a:ln>
+          </c:spPr>
+        </c:majorGridlines>
+        <c:title>
+          <c:tx>
+            <c:rich>
+              <a:bodyPr rot="-5400000"/>
+              <a:lstStyle/>
+              <a:p>
+                <a:pPr>
+                  <a:defRPr sz="1000" b="1" strike="noStrike" spc="-1">
+                    <a:solidFill>
+                      <a:srgbClr val="000000"/>
+                    </a:solidFill>
+                    <a:latin typeface="Calibri"/>
+                  </a:defRPr>
+                </a:pPr>
+                <a:r>
+                  <a:rPr lang="en-US" sz="1000" b="1" strike="noStrike" spc="-1">
+                    <a:solidFill>
+                      <a:srgbClr val="000000"/>
+                    </a:solidFill>
+                    <a:latin typeface="Calibri"/>
+                  </a:rPr>
+                  <a:t>Cumulative Cost ($)</a:t>
+                </a:r>
+              </a:p>
+            </c:rich>
+          </c:tx>
+          <c:overlay val="0"/>
+          <c:spPr>
+            <a:noFill/>
+            <a:ln w="0">
+              <a:noFill/>
+            </a:ln>
+          </c:spPr>
+        </c:title>
+        <c:numFmt formatCode="\$#,##0" sourceLinked="1"/>
+        <c:majorTickMark val="none"/>
+        <c:minorTickMark val="none"/>
+        <c:tickLblPos val="nextTo"/>
+        <c:spPr>
+          <a:ln w="9360">
+            <a:solidFill>
+              <a:srgbClr val="878787"/>
+            </a:solidFill>
+            <a:round/>
+          </a:ln>
+        </c:spPr>
+        <c:txPr>
+          <a:bodyPr/>
+          <a:lstStyle/>
+          <a:p>
+            <a:pPr>
+              <a:defRPr sz="1000" b="0" strike="noStrike" spc="-1">
+                <a:solidFill>
+                  <a:srgbClr val="000000"/>
+                </a:solidFill>
+                <a:latin typeface="Calibri"/>
+              </a:defRPr>
+            </a:pPr>
+            <a:endParaRPr lang="en-US"/>
+          </a:p>
+        </c:txPr>
+        <c:crossAx val="20483999"/>
+        <c:crosses val="autoZero"/>
+        <c:crossBetween val="between"/>
+      </c:valAx>
+      <c:spPr>
+        <a:noFill/>
+        <a:ln w="0">
+          <a:noFill/>
+        </a:ln>
+      </c:spPr>
+    </c:plotArea>
+    <c:legend>
+      <c:legendPos val="r"/>
+      <c:overlay val="0"/>
+      <c:spPr>
+        <a:noFill/>
+        <a:ln w="0">
+          <a:noFill/>
+        </a:ln>
+      </c:spPr>
+      <c:txPr>
+        <a:bodyPr/>
+        <a:lstStyle/>
+        <a:p>
+          <a:pPr>
+            <a:defRPr sz="1000" b="0" strike="noStrike" spc="-1">
+              <a:solidFill>
+                <a:srgbClr val="000000"/>
+              </a:solidFill>
+              <a:latin typeface="Calibri"/>
+            </a:defRPr>
+          </a:pPr>
+          <a:endParaRPr lang="en-US"/>
+        </a:p>
+      </c:txPr>
+    </c:legend>
+    <c:plotVisOnly val="1"/>
+    <c:dispBlanksAs val="gap"/>
+    <c:showDLblsOverMax val="1"/>
+  </c:chart>
+  <c:spPr>
+    <a:solidFill>
+      <a:srgbClr val="FFFFFF"/>
+    </a:solidFill>
+    <a:ln w="9360">
+      <a:solidFill>
+        <a:srgbClr val="D9D9D9"/>
+      </a:solidFill>
+      <a:round/>
+    </a:ln>
+  </c:spPr>
+  <c:externalData r:id="rId1">
+    <c:autoUpdate val="0"/>
+  </c:externalData>
+</c:chartSpace>
+</file>
+
 <file path=word/theme/theme1.xml><?xml version="1.0" encoding="utf-8"?>
 <a:theme xmlns:a="http://schemas.openxmlformats.org/drawingml/2006/main" name="Office Theme">
   <a:themeElements>

</xml_diff>